<commit_message>
feat: complete V3 vehicle sound realism overhaul
</commit_message>
<xml_diff>
--- a/VehicleSoundSynthV3_完整使用手册.docx
+++ b/VehicleSoundSynthV3_完整使用手册.docx
@@ -78,7 +78,7 @@
           <w:color w:val="0B2545"/>
           <w:sz w:val="21"/>
         </w:rPr>
-        <w:t>手册版本 3.0  |  适用 Max 8.6.5  |  2026-08-07</w:t>
+        <w:t>手册版本 3.1  |  适用 Max 8.6.5  |  2026-08-10</w:t>
       </w:r>
     </w:p>
     <w:p>
@@ -555,7 +555,7 @@
                 <w:color w:val="1F2937"/>
                 <w:sz w:val="18"/>
               </w:rPr>
-              <w:t>cabin_rumble~ / Gen</w:t>
+              <w:t>cabin_rumble~ / MSP</w:t>
             </w:r>
           </w:p>
         </w:tc>
@@ -580,7 +580,7 @@
                 <w:color w:val="1F2937"/>
                 <w:sz w:val="18"/>
               </w:rPr>
-              <w:t>半阶结构振动、48/68/92/118 Hz 车身模态、负载相关排气轰鸣</w:t>
+              <w:t>真实 powertrain 信号激励 48/68/92/118 Hz 阻尼模态、结构振动与排气轰鸣</w:t>
             </w:r>
           </w:p>
         </w:tc>
@@ -660,7 +660,7 @@
                 <w:color w:val="1F2937"/>
                 <w:sz w:val="18"/>
               </w:rPr>
-              <w:t>启动机、升降挡、回火、爆音、crackle 与受控路噪</w:t>
+              <w:t>CC0 启动机、升降挡、回火、爆音/crackle；粉红轮胎与受控白噪风声</w:t>
             </w:r>
           </w:p>
         </w:tc>
@@ -737,7 +737,7 @@
                 <w:color w:val="1F2937"/>
                 <w:sz w:val="18"/>
               </w:rPr>
-              <w:t>120 Hz 以下中置、四段 EQ、平滑旁路、总增益、最终 limiter/clip</w:t>
+              <w:t>短车舱 IR、IR 后低频收中、四段 EQ、总增益与唯一 limiter/clip</w:t>
             </w:r>
           </w:p>
         </w:tc>
@@ -1594,6 +1594,163 @@
                 <w:color w:val="1F2937"/>
                 <w:sz w:val="18"/>
               </w:rPr>
+              <w:t>四个 Stem Level</w:t>
+            </w:r>
+          </w:p>
+        </w:tc>
+        <w:tc>
+          <w:tcPr>
+            <w:tcW w:type="dxa" w:w="1900"/>
+            <w:shd w:fill="FAFBFC"/>
+            <w:vAlign w:val="center"/>
+            <w:tcMar>
+              <w:top w:w="80" w:type="dxa"/>
+              <w:bottom w:w="80" w:type="dxa"/>
+              <w:start w:w="120" w:type="dxa"/>
+              <w:end w:w="120" w:type="dxa"/>
+            </w:tcMar>
+          </w:tcPr>
+          <w:p>
+            <w:pPr>
+              <w:spacing w:after="0" w:line="264" w:lineRule="auto"/>
+            </w:pPr>
+            <w:r>
+              <w:rPr>
+                <w:rFonts w:ascii="Calibri" w:hAnsi="Calibri" w:eastAsia="PingFang SC"/>
+                <w:color w:val="1F2937"/>
+                <w:sz w:val="18"/>
+              </w:rPr>
+              <w:t>-60..+6 dB</w:t>
+            </w:r>
+          </w:p>
+        </w:tc>
+        <w:tc>
+          <w:tcPr>
+            <w:tcW w:type="dxa" w:w="5360"/>
+            <w:shd w:fill="FAFBFC"/>
+            <w:vAlign w:val="center"/>
+            <w:tcMar>
+              <w:top w:w="80" w:type="dxa"/>
+              <w:bottom w:w="80" w:type="dxa"/>
+              <w:start w:w="120" w:type="dxa"/>
+              <w:end w:w="120" w:type="dxa"/>
+            </w:tcMar>
+          </w:tcPr>
+          <w:p>
+            <w:pPr>
+              <w:spacing w:after="0" w:line="264" w:lineRule="auto"/>
+            </w:pPr>
+            <w:r>
+              <w:rPr>
+                <w:rFonts w:ascii="Calibri" w:hAnsi="Calibri" w:eastAsia="PingFang SC"/>
+                <w:color w:val="1F2937"/>
+                <w:sz w:val="18"/>
+              </w:rPr>
+              <w:t>Powertrain、Transient、Road、Rumble 独立 50 ms 平滑增益</w:t>
+            </w:r>
+          </w:p>
+        </w:tc>
+      </w:tr>
+      <w:tr>
+        <w:tc>
+          <w:tcPr>
+            <w:tcW w:type="dxa" w:w="2100"/>
+            <w:vAlign w:val="center"/>
+            <w:tcMar>
+              <w:top w:w="80" w:type="dxa"/>
+              <w:bottom w:w="80" w:type="dxa"/>
+              <w:start w:w="120" w:type="dxa"/>
+              <w:end w:w="120" w:type="dxa"/>
+            </w:tcMar>
+          </w:tcPr>
+          <w:p>
+            <w:pPr>
+              <w:spacing w:after="0" w:line="264" w:lineRule="auto"/>
+            </w:pPr>
+            <w:r>
+              <w:rPr>
+                <w:rFonts w:ascii="Calibri" w:hAnsi="Calibri" w:eastAsia="PingFang SC"/>
+                <w:color w:val="1F2937"/>
+                <w:sz w:val="18"/>
+              </w:rPr>
+              <w:t>Cabin IR Mix</w:t>
+            </w:r>
+          </w:p>
+        </w:tc>
+        <w:tc>
+          <w:tcPr>
+            <w:tcW w:type="dxa" w:w="1900"/>
+            <w:vAlign w:val="center"/>
+            <w:tcMar>
+              <w:top w:w="80" w:type="dxa"/>
+              <w:bottom w:w="80" w:type="dxa"/>
+              <w:start w:w="120" w:type="dxa"/>
+              <w:end w:w="120" w:type="dxa"/>
+            </w:tcMar>
+          </w:tcPr>
+          <w:p>
+            <w:pPr>
+              <w:spacing w:after="0" w:line="264" w:lineRule="auto"/>
+            </w:pPr>
+            <w:r>
+              <w:rPr>
+                <w:rFonts w:ascii="Calibri" w:hAnsi="Calibri" w:eastAsia="PingFang SC"/>
+                <w:color w:val="1F2937"/>
+                <w:sz w:val="18"/>
+              </w:rPr>
+              <w:t>0-1</w:t>
+            </w:r>
+          </w:p>
+        </w:tc>
+        <w:tc>
+          <w:tcPr>
+            <w:tcW w:type="dxa" w:w="5360"/>
+            <w:vAlign w:val="center"/>
+            <w:tcMar>
+              <w:top w:w="80" w:type="dxa"/>
+              <w:bottom w:w="80" w:type="dxa"/>
+              <w:start w:w="120" w:type="dxa"/>
+              <w:end w:w="120" w:type="dxa"/>
+            </w:tcMar>
+          </w:tcPr>
+          <w:p>
+            <w:pPr>
+              <w:spacing w:after="0" w:line="264" w:lineRule="auto"/>
+            </w:pPr>
+            <w:r>
+              <w:rPr>
+                <w:rFonts w:ascii="Calibri" w:hAnsi="Calibri" w:eastAsia="PingFang SC"/>
+                <w:color w:val="1F2937"/>
+                <w:sz w:val="18"/>
+              </w:rPr>
+              <w:t>原声与 4096 tap 车舱 IR 的等功率湿/干混合</w:t>
+            </w:r>
+          </w:p>
+        </w:tc>
+      </w:tr>
+      <w:tr>
+        <w:tc>
+          <w:tcPr>
+            <w:tcW w:type="dxa" w:w="2100"/>
+            <w:shd w:fill="FAFBFC"/>
+            <w:vAlign w:val="center"/>
+            <w:tcMar>
+              <w:top w:w="80" w:type="dxa"/>
+              <w:bottom w:w="80" w:type="dxa"/>
+              <w:start w:w="120" w:type="dxa"/>
+              <w:end w:w="120" w:type="dxa"/>
+            </w:tcMar>
+          </w:tcPr>
+          <w:p>
+            <w:pPr>
+              <w:spacing w:after="0" w:line="264" w:lineRule="auto"/>
+            </w:pPr>
+            <w:r>
+              <w:rPr>
+                <w:rFonts w:ascii="Calibri" w:hAnsi="Calibri" w:eastAsia="PingFang SC"/>
+                <w:color w:val="1F2937"/>
+                <w:sz w:val="18"/>
+              </w:rPr>
               <w:t>Global EQ</w:t>
             </w:r>
           </w:p>
@@ -1751,7 +1908,7 @@
         <w:rPr>
           <w:rFonts w:ascii="Calibri" w:hAnsi="Calibri" w:eastAsia="PingFang SC"/>
         </w:rPr>
-        <w:t>燃油 Gen 使用四冲程点火阶次：V12 主阶为 rpm/60×6，V10 主阶为 rpm/60×5。V12 在 780 rpm 时主阶约 78 Hz、半阶约 39 Hz；V10 在 850 rpm 时主阶约 70.8 Hz、半阶约 35.4 Hz。新低频模块让这些阶次进一步激励车身与座舱模态，而不只是给原声做低架提升。</w:t>
+        <w:t>燃油 Gen 使用四冲程点火阶次：V12 主阶为 rpm/60×6，V10 主阶为 rpm/60×5。V12 在 780 rpm 时主阶约 78 Hz、半阶约 39 Hz；V10 在 850 rpm 时主阶约 70.8 Hz、半阶约 35.4 Hz。主声不是单一 cycle~：由曲轴相关点火脉冲、二至八阶加法谐波、AM/FM 侧带、V12 的 0.83/1.17 与 2.33/2.67 非整数阶次、V10 的 0.81/1.19 与 2.20/2.80 阶次共同构成。新低频模块再用同一 powertrain 音频激励车身与座舱模态，而不是另开一个不相关的正弦振荡器。</w:t>
       </w:r>
     </w:p>
     <w:tbl>
@@ -2553,7 +2710,7 @@
                 <w:rFonts w:ascii="Calibri" w:hAnsi="Calibri" w:eastAsia="PingFang SC"/>
                 <w:color w:val="0B2545"/>
               </w:rPr>
-              <w:t>低频层在约 28 Hz 高通，座舱在 120 Hz 以下收回中置，最后仍经过全局 EQ、Master Trim 和唯一的 limiter/clip。普通音箱听不清 35 Hz 时，不要盲目把三个旋钮全部推满；先用 Cabin Rumble，再少量增加 Structure Vibration。</w:t>
+              <w:t>低频层在约 28 Hz 高通；Side 在车舱处理前高通，并在 IR 湿/干混合后再经四级 180 Hz 高通，所以真正的深低频保持居中。最后仍经过全局 EQ、Master Trim 和唯一的 limiter/clip。普通音箱听不清 35 Hz 时，不要盲目把三个旋钮全部推满。</w:t>
             </w:r>
           </w:p>
         </w:tc>
@@ -3008,7 +3165,7 @@
         <w:rPr>
           <w:rFonts w:ascii="Calibri" w:hAnsi="Calibri" w:eastAsia="PingFang SC"/>
         </w:rPr>
-        <w:t>V12 速比：3.10 / 2.13 / 1.62 / 1.29 / 1.03 / 0.84 / 0.70。V10 速比：3.13 / 2.10 / 1.52 / 1.20 / 0.94 / 0.76 / 0.62。事件样本采用 round-robin 变体，避免连续换挡或回火时出现完全相同的“机关枪”重复。</w:t>
+        <w:t>V12 速比：3.10 / 2.13 / 1.62 / 1.29 / 1.03 / 0.84 / 0.70。V10 速比：3.13 / 2.10 / 1.52 / 1.20 / 0.94 / 0.76 / 0.62。启动、换挡、回火、爆音、crackle 与机械细节均来自已处理的 CC0 现场录音；事件采用 round-robin 变体，避免连续触发出现完全相同的“机关枪”重复。</w:t>
       </w:r>
     </w:p>
     <w:p>
@@ -3645,7 +3802,15 @@
         <w:rPr>
           <w:rFonts w:ascii="Calibri" w:hAnsi="Calibri" w:eastAsia="PingFang SC"/>
         </w:rPr>
-        <w:t>road_air~ 的最高速度增益从 0.32 降至 0.12，低通控制范围收窄为约 500-3500 Hz，lores~ 共振也降至 0.35。这样高速路噪仍存在，但不会覆盖 V12/V10 的中低频点火结构。</w:t>
+        <w:t>EQ 已用 Max 运行时 probe 验证：各峰值段在中心频率发送 -12 dB 时约衰减 12 dB；90 Hz 与 9 kHz 的 -12 dB shelf 在测量点约衰减 6 dB（符合 shelf 转折频率定义）；Master Trim 从 -8 到 -24 dB 实测约 -15.9 dB；Bypass 与 flat 的差异约 0.05 dB。</w:t>
+      </w:r>
+    </w:p>
+    <w:p>
+      <w:r>
+        <w:rPr>
+          <w:rFonts w:ascii="Calibri" w:hAnsi="Calibri" w:eastAsia="PingFang SC"/>
+        </w:rPr>
+        <w:t>road_air~ 只有两类持续噪声：居中的 pink~ 轮胎床（约 70-900 Hz）和受控立体声 noise~ 风声（约 400-4000 Hz）。Road Level 默认 -16 dB，风声随速度约 1.7 次幂上升；这两层不会再用宽带白噪覆盖整个频谱。</w:t>
       </w:r>
     </w:p>
     <w:p>
@@ -3657,7 +3822,671 @@
           <w:rFonts w:ascii="Calibri" w:hAnsi="Calibri" w:eastAsia="PingFang SC"/>
           <w:b/>
         </w:rPr>
-        <w:t>8. 外部状态接入</w:t>
+        <w:t>8. 素材、归一化与拟真边界</w:t>
+      </w:r>
+    </w:p>
+    <w:tbl>
+      <w:tblPr>
+        <w:tblW w:type="dxa" w:w="9360"/>
+        <w:tblLayout w:type="fixed"/>
+        <w:tblLook w:firstColumn="1" w:firstRow="1" w:lastColumn="0" w:lastRow="0" w:noHBand="0" w:noVBand="1" w:val="04A0"/>
+        <w:jc w:val="left"/>
+        <w:tblInd w:w="120" w:type="dxa"/>
+        <w:tblBorders>
+          <w:top w:val="single" w:sz="6" w:space="0" w:color="C8D1DC"/>
+          <w:left w:val="single" w:sz="6" w:space="0" w:color="C8D1DC"/>
+          <w:bottom w:val="single" w:sz="6" w:space="0" w:color="C8D1DC"/>
+          <w:right w:val="single" w:sz="6" w:space="0" w:color="C8D1DC"/>
+          <w:insideH w:val="single" w:sz="6" w:space="0" w:color="C8D1DC"/>
+          <w:insideV w:val="single" w:sz="6" w:space="0" w:color="C8D1DC"/>
+        </w:tblBorders>
+      </w:tblPr>
+      <w:tblGrid>
+        <w:gridCol w:w="2600"/>
+        <w:gridCol w:w="3200"/>
+        <w:gridCol w:w="3560"/>
+      </w:tblGrid>
+      <w:tr>
+        <w:trPr>
+          <w:tblHeader/>
+        </w:trPr>
+        <w:tc>
+          <w:tcPr>
+            <w:tcW w:type="dxa" w:w="2600"/>
+            <w:vAlign w:val="center"/>
+            <w:tcMar>
+              <w:top w:w="80" w:type="dxa"/>
+              <w:bottom w:w="80" w:type="dxa"/>
+              <w:start w:w="120" w:type="dxa"/>
+              <w:end w:w="120" w:type="dxa"/>
+            </w:tcMar>
+            <w:shd w:fill="E8EEF5"/>
+          </w:tcPr>
+          <w:p>
+            <w:pPr>
+              <w:spacing w:after="0"/>
+            </w:pPr>
+            <w:r>
+              <w:rPr>
+                <w:rFonts w:ascii="Calibri" w:hAnsi="Calibri" w:eastAsia="PingFang SC"/>
+                <w:b/>
+                <w:color w:val="0B2545"/>
+                <w:sz w:val="17"/>
+              </w:rPr>
+              <w:t>来源</w:t>
+            </w:r>
+          </w:p>
+        </w:tc>
+        <w:tc>
+          <w:tcPr>
+            <w:tcW w:type="dxa" w:w="3200"/>
+            <w:vAlign w:val="center"/>
+            <w:tcMar>
+              <w:top w:w="80" w:type="dxa"/>
+              <w:bottom w:w="80" w:type="dxa"/>
+              <w:start w:w="120" w:type="dxa"/>
+              <w:end w:w="120" w:type="dxa"/>
+            </w:tcMar>
+            <w:shd w:fill="E8EEF5"/>
+          </w:tcPr>
+          <w:p>
+            <w:pPr>
+              <w:spacing w:after="0"/>
+            </w:pPr>
+            <w:r>
+              <w:rPr>
+                <w:rFonts w:ascii="Calibri" w:hAnsi="Calibri" w:eastAsia="PingFang SC"/>
+                <w:b/>
+                <w:color w:val="0B2545"/>
+                <w:sz w:val="17"/>
+              </w:rPr>
+              <w:t>运行用途</w:t>
+            </w:r>
+          </w:p>
+        </w:tc>
+        <w:tc>
+          <w:tcPr>
+            <w:tcW w:type="dxa" w:w="3560"/>
+            <w:vAlign w:val="center"/>
+            <w:tcMar>
+              <w:top w:w="80" w:type="dxa"/>
+              <w:bottom w:w="80" w:type="dxa"/>
+              <w:start w:w="120" w:type="dxa"/>
+              <w:end w:w="120" w:type="dxa"/>
+            </w:tcMar>
+            <w:shd w:fill="E8EEF5"/>
+          </w:tcPr>
+          <w:p>
+            <w:pPr>
+              <w:spacing w:after="0"/>
+            </w:pPr>
+            <w:r>
+              <w:rPr>
+                <w:rFonts w:ascii="Calibri" w:hAnsi="Calibri" w:eastAsia="PingFang SC"/>
+                <w:b/>
+                <w:color w:val="0B2545"/>
+                <w:sz w:val="17"/>
+              </w:rPr>
+              <w:t>处理/峰值</w:t>
+            </w:r>
+          </w:p>
+        </w:tc>
+      </w:tr>
+      <w:tr>
+        <w:tc>
+          <w:tcPr>
+            <w:tcW w:type="dxa" w:w="2600"/>
+            <w:vAlign w:val="center"/>
+            <w:tcMar>
+              <w:top w:w="80" w:type="dxa"/>
+              <w:bottom w:w="80" w:type="dxa"/>
+              <w:start w:w="120" w:type="dxa"/>
+              <w:end w:w="120" w:type="dxa"/>
+            </w:tcMar>
+          </w:tcPr>
+          <w:p>
+            <w:pPr>
+              <w:spacing w:after="0" w:line="264" w:lineRule="auto"/>
+            </w:pPr>
+            <w:r>
+              <w:rPr>
+                <w:rFonts w:ascii="Calibri" w:hAnsi="Calibri" w:eastAsia="PingFang SC"/>
+                <w:color w:val="1F2937"/>
+                <w:sz w:val="17"/>
+              </w:rPr>
+              <w:t>Grasopt — Car Starter</w:t>
+            </w:r>
+          </w:p>
+        </w:tc>
+        <w:tc>
+          <w:tcPr>
+            <w:tcW w:type="dxa" w:w="3200"/>
+            <w:vAlign w:val="center"/>
+            <w:tcMar>
+              <w:top w:w="80" w:type="dxa"/>
+              <w:bottom w:w="80" w:type="dxa"/>
+              <w:start w:w="120" w:type="dxa"/>
+              <w:end w:w="120" w:type="dxa"/>
+            </w:tcMar>
+          </w:tcPr>
+          <w:p>
+            <w:pPr>
+              <w:spacing w:after="0" w:line="264" w:lineRule="auto"/>
+            </w:pPr>
+            <w:r>
+              <w:rPr>
+                <w:rFonts w:ascii="Calibri" w:hAnsi="Calibri" w:eastAsia="PingFang SC"/>
+                <w:color w:val="1F2937"/>
+                <w:sz w:val="17"/>
+              </w:rPr>
+              <w:t>V12/V10 启动机</w:t>
+            </w:r>
+          </w:p>
+        </w:tc>
+        <w:tc>
+          <w:tcPr>
+            <w:tcW w:type="dxa" w:w="3560"/>
+            <w:vAlign w:val="center"/>
+            <w:tcMar>
+              <w:top w:w="80" w:type="dxa"/>
+              <w:bottom w:w="80" w:type="dxa"/>
+              <w:start w:w="120" w:type="dxa"/>
+              <w:end w:w="120" w:type="dxa"/>
+            </w:tcMar>
+          </w:tcPr>
+          <w:p>
+            <w:pPr>
+              <w:spacing w:after="0" w:line="264" w:lineRule="auto"/>
+            </w:pPr>
+            <w:r>
+              <w:rPr>
+                <w:rFonts w:ascii="Calibri" w:hAnsi="Calibri" w:eastAsia="PingFang SC"/>
+                <w:color w:val="1F2937"/>
+                <w:sz w:val="17"/>
+              </w:rPr>
+              <w:t>48 kHz PCM16、去 DC、淡入淡出、-3 dBFS</w:t>
+            </w:r>
+          </w:p>
+        </w:tc>
+      </w:tr>
+      <w:tr>
+        <w:tc>
+          <w:tcPr>
+            <w:tcW w:type="dxa" w:w="2600"/>
+            <w:shd w:fill="FAFBFC"/>
+            <w:vAlign w:val="center"/>
+            <w:tcMar>
+              <w:top w:w="80" w:type="dxa"/>
+              <w:bottom w:w="80" w:type="dxa"/>
+              <w:start w:w="120" w:type="dxa"/>
+              <w:end w:w="120" w:type="dxa"/>
+            </w:tcMar>
+          </w:tcPr>
+          <w:p>
+            <w:pPr>
+              <w:spacing w:after="0" w:line="264" w:lineRule="auto"/>
+            </w:pPr>
+            <w:r>
+              <w:rPr>
+                <w:rFonts w:ascii="Calibri" w:hAnsi="Calibri" w:eastAsia="PingFang SC"/>
+                <w:color w:val="1F2937"/>
+                <w:sz w:val="17"/>
+              </w:rPr>
+              <w:t>TheLittleCrow — Engine contact</w:t>
+            </w:r>
+          </w:p>
+        </w:tc>
+        <w:tc>
+          <w:tcPr>
+            <w:tcW w:type="dxa" w:w="3200"/>
+            <w:shd w:fill="FAFBFC"/>
+            <w:vAlign w:val="center"/>
+            <w:tcMar>
+              <w:top w:w="80" w:type="dxa"/>
+              <w:bottom w:w="80" w:type="dxa"/>
+              <w:start w:w="120" w:type="dxa"/>
+              <w:end w:w="120" w:type="dxa"/>
+            </w:tcMar>
+          </w:tcPr>
+          <w:p>
+            <w:pPr>
+              <w:spacing w:after="0" w:line="264" w:lineRule="auto"/>
+            </w:pPr>
+            <w:r>
+              <w:rPr>
+                <w:rFonts w:ascii="Calibri" w:hAnsi="Calibri" w:eastAsia="PingFang SC"/>
+                <w:color w:val="1F2937"/>
+                <w:sz w:val="17"/>
+              </w:rPr>
+              <w:t>三组升挡与三组降挡</w:t>
+            </w:r>
+          </w:p>
+        </w:tc>
+        <w:tc>
+          <w:tcPr>
+            <w:tcW w:type="dxa" w:w="3560"/>
+            <w:shd w:fill="FAFBFC"/>
+            <w:vAlign w:val="center"/>
+            <w:tcMar>
+              <w:top w:w="80" w:type="dxa"/>
+              <w:bottom w:w="80" w:type="dxa"/>
+              <w:start w:w="120" w:type="dxa"/>
+              <w:end w:w="120" w:type="dxa"/>
+            </w:tcMar>
+          </w:tcPr>
+          <w:p>
+            <w:pPr>
+              <w:spacing w:after="0" w:line="264" w:lineRule="auto"/>
+            </w:pPr>
+            <w:r>
+              <w:rPr>
+                <w:rFonts w:ascii="Calibri" w:hAnsi="Calibri" w:eastAsia="PingFang SC"/>
+                <w:color w:val="1F2937"/>
+                <w:sz w:val="17"/>
+              </w:rPr>
+              <w:t>裁切、归一化至 -6 dBFS</w:t>
+            </w:r>
+          </w:p>
+        </w:tc>
+      </w:tr>
+      <w:tr>
+        <w:tc>
+          <w:tcPr>
+            <w:tcW w:type="dxa" w:w="2600"/>
+            <w:vAlign w:val="center"/>
+            <w:tcMar>
+              <w:top w:w="80" w:type="dxa"/>
+              <w:bottom w:w="80" w:type="dxa"/>
+              <w:start w:w="120" w:type="dxa"/>
+              <w:end w:w="120" w:type="dxa"/>
+            </w:tcMar>
+          </w:tcPr>
+          <w:p>
+            <w:pPr>
+              <w:spacing w:after="0" w:line="264" w:lineRule="auto"/>
+            </w:pPr>
+            <w:r>
+              <w:rPr>
+                <w:rFonts w:ascii="Calibri" w:hAnsi="Calibri" w:eastAsia="PingFang SC"/>
+                <w:color w:val="1F2937"/>
+                <w:sz w:val="17"/>
+              </w:rPr>
+              <w:t>richwise — Sports/Supercar</w:t>
+            </w:r>
+          </w:p>
+        </w:tc>
+        <w:tc>
+          <w:tcPr>
+            <w:tcW w:type="dxa" w:w="3200"/>
+            <w:vAlign w:val="center"/>
+            <w:tcMar>
+              <w:top w:w="80" w:type="dxa"/>
+              <w:bottom w:w="80" w:type="dxa"/>
+              <w:start w:w="120" w:type="dxa"/>
+              <w:end w:w="120" w:type="dxa"/>
+            </w:tcMar>
+          </w:tcPr>
+          <w:p>
+            <w:pPr>
+              <w:spacing w:after="0" w:line="264" w:lineRule="auto"/>
+            </w:pPr>
+            <w:r>
+              <w:rPr>
+                <w:rFonts w:ascii="Calibri" w:hAnsi="Calibri" w:eastAsia="PingFang SC"/>
+                <w:color w:val="1F2937"/>
+                <w:sz w:val="17"/>
+              </w:rPr>
+              <w:t>进气回火、排气 pop/crackle</w:t>
+            </w:r>
+          </w:p>
+        </w:tc>
+        <w:tc>
+          <w:tcPr>
+            <w:tcW w:type="dxa" w:w="3560"/>
+            <w:vAlign w:val="center"/>
+            <w:tcMar>
+              <w:top w:w="80" w:type="dxa"/>
+              <w:bottom w:w="80" w:type="dxa"/>
+              <w:start w:w="120" w:type="dxa"/>
+              <w:end w:w="120" w:type="dxa"/>
+            </w:tcMar>
+          </w:tcPr>
+          <w:p>
+            <w:pPr>
+              <w:spacing w:after="0" w:line="264" w:lineRule="auto"/>
+            </w:pPr>
+            <w:r>
+              <w:rPr>
+                <w:rFonts w:ascii="Calibri" w:hAnsi="Calibri" w:eastAsia="PingFang SC"/>
+                <w:color w:val="1F2937"/>
+                <w:sz w:val="17"/>
+              </w:rPr>
+              <w:t>回火 -6、pop -5、crackle -8 dBFS</w:t>
+            </w:r>
+          </w:p>
+        </w:tc>
+      </w:tr>
+      <w:tr>
+        <w:tc>
+          <w:tcPr>
+            <w:tcW w:type="dxa" w:w="2600"/>
+            <w:shd w:fill="FAFBFC"/>
+            <w:vAlign w:val="center"/>
+            <w:tcMar>
+              <w:top w:w="80" w:type="dxa"/>
+              <w:bottom w:w="80" w:type="dxa"/>
+              <w:start w:w="120" w:type="dxa"/>
+              <w:end w:w="120" w:type="dxa"/>
+            </w:tcMar>
+          </w:tcPr>
+          <w:p>
+            <w:pPr>
+              <w:spacing w:after="0" w:line="264" w:lineRule="auto"/>
+            </w:pPr>
+            <w:r>
+              <w:rPr>
+                <w:rFonts w:ascii="Calibri" w:hAnsi="Calibri" w:eastAsia="PingFang SC"/>
+                <w:color w:val="1F2937"/>
+                <w:sz w:val="17"/>
+              </w:rPr>
+              <w:t>microman502 — Gear shift</w:t>
+            </w:r>
+          </w:p>
+        </w:tc>
+        <w:tc>
+          <w:tcPr>
+            <w:tcW w:type="dxa" w:w="3200"/>
+            <w:shd w:fill="FAFBFC"/>
+            <w:vAlign w:val="center"/>
+            <w:tcMar>
+              <w:top w:w="80" w:type="dxa"/>
+              <w:bottom w:w="80" w:type="dxa"/>
+              <w:start w:w="120" w:type="dxa"/>
+              <w:end w:w="120" w:type="dxa"/>
+            </w:tcMar>
+          </w:tcPr>
+          <w:p>
+            <w:pPr>
+              <w:spacing w:after="0" w:line="264" w:lineRule="auto"/>
+            </w:pPr>
+            <w:r>
+              <w:rPr>
+                <w:rFonts w:ascii="Calibri" w:hAnsi="Calibri" w:eastAsia="PingFang SC"/>
+                <w:color w:val="1F2937"/>
+                <w:sz w:val="17"/>
+              </w:rPr>
+              <w:t>机械 click 与 shift thump</w:t>
+            </w:r>
+          </w:p>
+        </w:tc>
+        <w:tc>
+          <w:tcPr>
+            <w:tcW w:type="dxa" w:w="3560"/>
+            <w:shd w:fill="FAFBFC"/>
+            <w:vAlign w:val="center"/>
+            <w:tcMar>
+              <w:top w:w="80" w:type="dxa"/>
+              <w:bottom w:w="80" w:type="dxa"/>
+              <w:start w:w="120" w:type="dxa"/>
+              <w:end w:w="120" w:type="dxa"/>
+            </w:tcMar>
+          </w:tcPr>
+          <w:p>
+            <w:pPr>
+              <w:spacing w:after="0" w:line="264" w:lineRule="auto"/>
+            </w:pPr>
+            <w:r>
+              <w:rPr>
+                <w:rFonts w:ascii="Calibri" w:hAnsi="Calibri" w:eastAsia="PingFang SC"/>
+                <w:color w:val="1F2937"/>
+                <w:sz w:val="17"/>
+              </w:rPr>
+              <w:t>裁切、去 DC、-6 dBFS</w:t>
+            </w:r>
+          </w:p>
+        </w:tc>
+      </w:tr>
+      <w:tr>
+        <w:tc>
+          <w:tcPr>
+            <w:tcW w:type="dxa" w:w="2600"/>
+            <w:vAlign w:val="center"/>
+            <w:tcMar>
+              <w:top w:w="80" w:type="dxa"/>
+              <w:bottom w:w="80" w:type="dxa"/>
+              <w:start w:w="120" w:type="dxa"/>
+              <w:end w:w="120" w:type="dxa"/>
+            </w:tcMar>
+          </w:tcPr>
+          <w:p>
+            <w:pPr>
+              <w:spacing w:after="0" w:line="264" w:lineRule="auto"/>
+            </w:pPr>
+            <w:r>
+              <w:rPr>
+                <w:rFonts w:ascii="Calibri" w:hAnsi="Calibri" w:eastAsia="PingFang SC"/>
+                <w:color w:val="1F2937"/>
+                <w:sz w:val="17"/>
+              </w:rPr>
+              <w:t>jamespeacock4616 — Mini car IR</w:t>
+            </w:r>
+          </w:p>
+        </w:tc>
+        <w:tc>
+          <w:tcPr>
+            <w:tcW w:type="dxa" w:w="3200"/>
+            <w:vAlign w:val="center"/>
+            <w:tcMar>
+              <w:top w:w="80" w:type="dxa"/>
+              <w:bottom w:w="80" w:type="dxa"/>
+              <w:start w:w="120" w:type="dxa"/>
+              <w:end w:w="120" w:type="dxa"/>
+            </w:tcMar>
+          </w:tcPr>
+          <w:p>
+            <w:pPr>
+              <w:spacing w:after="0" w:line="264" w:lineRule="auto"/>
+            </w:pPr>
+            <w:r>
+              <w:rPr>
+                <w:rFonts w:ascii="Calibri" w:hAnsi="Calibri" w:eastAsia="PingFang SC"/>
+                <w:color w:val="1F2937"/>
+                <w:sz w:val="17"/>
+              </w:rPr>
+              <w:t>左右 4096 tap 车舱 IR</w:t>
+            </w:r>
+          </w:p>
+        </w:tc>
+        <w:tc>
+          <w:tcPr>
+            <w:tcW w:type="dxa" w:w="3560"/>
+            <w:vAlign w:val="center"/>
+            <w:tcMar>
+              <w:top w:w="80" w:type="dxa"/>
+              <w:bottom w:w="80" w:type="dxa"/>
+              <w:start w:w="120" w:type="dxa"/>
+              <w:end w:w="120" w:type="dxa"/>
+            </w:tcMar>
+          </w:tcPr>
+          <w:p>
+            <w:pPr>
+              <w:spacing w:after="0" w:line="264" w:lineRule="auto"/>
+            </w:pPr>
+            <w:r>
+              <w:rPr>
+                <w:rFonts w:ascii="Calibri" w:hAnsi="Calibri" w:eastAsia="PingFang SC"/>
+                <w:color w:val="1F2937"/>
+                <w:sz w:val="17"/>
+              </w:rPr>
+              <w:t>每声道单独裁切、-3 dBFS</w:t>
+            </w:r>
+          </w:p>
+        </w:tc>
+      </w:tr>
+      <w:tr>
+        <w:tc>
+          <w:tcPr>
+            <w:tcW w:type="dxa" w:w="2600"/>
+            <w:shd w:fill="FAFBFC"/>
+            <w:vAlign w:val="center"/>
+            <w:tcMar>
+              <w:top w:w="80" w:type="dxa"/>
+              <w:bottom w:w="80" w:type="dxa"/>
+              <w:start w:w="120" w:type="dxa"/>
+              <w:end w:w="120" w:type="dxa"/>
+            </w:tcMar>
+          </w:tcPr>
+          <w:p>
+            <w:pPr>
+              <w:spacing w:after="0" w:line="264" w:lineRule="auto"/>
+            </w:pPr>
+            <w:r>
+              <w:rPr>
+                <w:rFonts w:ascii="Calibri" w:hAnsi="Calibri" w:eastAsia="PingFang SC"/>
+                <w:color w:val="1F2937"/>
+                <w:sz w:val="17"/>
+              </w:rPr>
+              <w:t>biholao — Ferrari acceleration</w:t>
+            </w:r>
+          </w:p>
+        </w:tc>
+        <w:tc>
+          <w:tcPr>
+            <w:tcW w:type="dxa" w:w="3200"/>
+            <w:shd w:fill="FAFBFC"/>
+            <w:vAlign w:val="center"/>
+            <w:tcMar>
+              <w:top w:w="80" w:type="dxa"/>
+              <w:bottom w:w="80" w:type="dxa"/>
+              <w:start w:w="120" w:type="dxa"/>
+              <w:end w:w="120" w:type="dxa"/>
+            </w:tcMar>
+          </w:tcPr>
+          <w:p>
+            <w:pPr>
+              <w:spacing w:after="0" w:line="264" w:lineRule="auto"/>
+            </w:pPr>
+            <w:r>
+              <w:rPr>
+                <w:rFonts w:ascii="Calibri" w:hAnsi="Calibri" w:eastAsia="PingFang SC"/>
+                <w:color w:val="1F2937"/>
+                <w:sz w:val="17"/>
+              </w:rPr>
+              <w:t>仅作听觉参考</w:t>
+            </w:r>
+          </w:p>
+        </w:tc>
+        <w:tc>
+          <w:tcPr>
+            <w:tcW w:type="dxa" w:w="3560"/>
+            <w:shd w:fill="FAFBFC"/>
+            <w:vAlign w:val="center"/>
+            <w:tcMar>
+              <w:top w:w="80" w:type="dxa"/>
+              <w:bottom w:w="80" w:type="dxa"/>
+              <w:start w:w="120" w:type="dxa"/>
+              <w:end w:w="120" w:type="dxa"/>
+            </w:tcMar>
+          </w:tcPr>
+          <w:p>
+            <w:pPr>
+              <w:spacing w:after="0" w:line="264" w:lineRule="auto"/>
+            </w:pPr>
+            <w:r>
+              <w:rPr>
+                <w:rFonts w:ascii="Calibri" w:hAnsi="Calibri" w:eastAsia="PingFang SC"/>
+                <w:color w:val="1F2937"/>
+                <w:sz w:val="17"/>
+              </w:rPr>
+              <w:t>不进入运行 patch</w:t>
+            </w:r>
+          </w:p>
+        </w:tc>
+      </w:tr>
+    </w:tbl>
+    <w:p>
+      <w:pPr>
+        <w:spacing w:after="0"/>
+      </w:pPr>
+    </w:p>
+    <w:tbl>
+      <w:tblPr>
+        <w:tblW w:type="dxa" w:w="9360"/>
+        <w:jc w:val="left"/>
+        <w:tblLayout w:type="fixed"/>
+        <w:tblLook w:firstColumn="1" w:firstRow="1" w:lastColumn="0" w:lastRow="0" w:noHBand="0" w:noVBand="1" w:val="04A0"/>
+        <w:tblInd w:w="120" w:type="dxa"/>
+        <w:tblBorders>
+          <w:top w:val="single" w:sz="6" w:space="0" w:color="C8D1DC"/>
+          <w:left w:val="single" w:sz="6" w:space="0" w:color="C8D1DC"/>
+          <w:bottom w:val="single" w:sz="6" w:space="0" w:color="C8D1DC"/>
+          <w:right w:val="single" w:sz="6" w:space="0" w:color="C8D1DC"/>
+          <w:insideH w:val="single" w:sz="6" w:space="0" w:color="C8D1DC"/>
+          <w:insideV w:val="single" w:sz="6" w:space="0" w:color="C8D1DC"/>
+        </w:tblBorders>
+      </w:tblPr>
+      <w:tblGrid>
+        <w:gridCol w:w="9360"/>
+      </w:tblGrid>
+      <w:tr>
+        <w:tc>
+          <w:tcPr>
+            <w:tcW w:type="dxa" w:w="9360"/>
+            <w:vAlign w:val="center"/>
+            <w:tcMar>
+              <w:top w:w="80" w:type="dxa"/>
+              <w:bottom w:w="80" w:type="dxa"/>
+              <w:start w:w="120" w:type="dxa"/>
+              <w:end w:w="120" w:type="dxa"/>
+            </w:tcMar>
+            <w:shd w:fill="F4F6F9"/>
+          </w:tcPr>
+          <w:p>
+            <w:pPr>
+              <w:spacing w:after="0"/>
+            </w:pPr>
+            <w:r>
+              <w:rPr>
+                <w:rFonts w:ascii="Calibri" w:hAnsi="Calibri" w:eastAsia="PingFang SC"/>
+                <w:b/>
+                <w:color w:val="1F4D78"/>
+              </w:rPr>
+              <w:t xml:space="preserve">为什么仍不是录音级复刻  </w:t>
+            </w:r>
+            <w:r>
+              <w:rPr>
+                <w:rFonts w:ascii="Calibri" w:hAnsi="Calibri" w:eastAsia="PingFang SC"/>
+                <w:color w:val="0B2545"/>
+              </w:rPr>
+              <w:t>短事件和 IR 已是真实录音，但连续 V12/V10 仍是程序化模型，没有同一辆车在多 RPM/多负载、进气/排气/机舱/座舱多麦克风条件下的同步测量，也没有卷积的机脚与车身传递函数。因此它比纯正弦原型更有机械结构，却仍属于可调 sound-design archetype。</w:t>
+            </w:r>
+          </w:p>
+        </w:tc>
+      </w:tr>
+    </w:tbl>
+    <w:p>
+      <w:pPr>
+        <w:spacing w:after="0"/>
+      </w:pPr>
+    </w:p>
+    <w:p>
+      <w:r>
+        <w:rPr>
+          <w:rFonts w:ascii="Calibri" w:hAnsi="Calibri" w:eastAsia="PingFang SC"/>
+        </w:rPr>
+        <w:t>全部来源、许可、原始/处理后 SHA-256、裁切点、帧数和归一化目标见 ASSET_LICENSES.md 与 assets/asset_manifest.json。build_project.py 不覆盖已经存在的 curated media。</w:t>
+      </w:r>
+    </w:p>
+    <w:p>
+      <w:pPr>
+        <w:pStyle w:val="Heading1"/>
+      </w:pPr>
+      <w:r>
+        <w:rPr>
+          <w:rFonts w:ascii="Calibri" w:hAnsi="Calibri" w:eastAsia="PingFang SC"/>
+          <w:b/>
+        </w:rPr>
+        <w:t>9. 外部状态接入</w:t>
       </w:r>
     </w:p>
     <w:p>
@@ -3691,6 +4520,25 @@
         <w:t>intake_backfire 1   exhaust_pop 1       click 1</w:t>
         <w:br/>
         <w:t>cabin_rumble 0.90   exhaust_boom 0.62   structure_vibration 0.58</w:t>
+      </w:r>
+    </w:p>
+    <w:p>
+      <w:pPr>
+        <w:spacing w:before="60" w:after="140" w:line="252" w:lineRule="auto"/>
+        <w:ind w:left="259" w:right="259"/>
+        <w:shd w:fill="F7F8FA"/>
+      </w:pPr>
+      <w:r>
+        <w:rPr>
+          <w:rFonts w:ascii="Menlo" w:hAnsi="Menlo" w:eastAsia="PingFang SC"/>
+          <w:color w:val="0B2545"/>
+          <w:sz w:val="18"/>
+        </w:rPr>
+        <w:t>powertrain_level_db -3.   transient_level_db -7.</w:t>
+        <w:br/>
+        <w:t>road_level_db -16.        rumble_level_db -5.</w:t>
+        <w:br/>
+        <w:t>cabin_ir_mix 0.20</w:t>
       </w:r>
     </w:p>
     <w:p>
@@ -3735,7 +4583,7 @@
           <w:rFonts w:ascii="Calibri" w:hAnsi="Calibri" w:eastAsia="PingFang SC"/>
           <w:b/>
         </w:rPr>
-        <w:t>9. 验证与故障排查</w:t>
+        <w:t>10. 验证与故障排查</w:t>
       </w:r>
     </w:p>
     <w:tbl>
@@ -4259,6 +5107,163 @@
                 <w:color w:val="1F2937"/>
                 <w:sz w:val="18"/>
               </w:rPr>
+              <w:t>EQ 看似无效</w:t>
+            </w:r>
+          </w:p>
+        </w:tc>
+        <w:tc>
+          <w:tcPr>
+            <w:tcW w:type="dxa" w:w="3000"/>
+            <w:shd w:fill="FAFBFC"/>
+            <w:vAlign w:val="center"/>
+            <w:tcMar>
+              <w:top w:w="80" w:type="dxa"/>
+              <w:bottom w:w="80" w:type="dxa"/>
+              <w:start w:w="120" w:type="dxa"/>
+              <w:end w:w="120" w:type="dxa"/>
+            </w:tcMar>
+          </w:tcPr>
+          <w:p>
+            <w:pPr>
+              <w:spacing w:after="0" w:line="264" w:lineRule="auto"/>
+            </w:pPr>
+            <w:r>
+              <w:rPr>
+                <w:rFonts w:ascii="Calibri" w:hAnsi="Calibri" w:eastAsia="PingFang SC"/>
+                <w:color w:val="1F2937"/>
+                <w:sz w:val="18"/>
+              </w:rPr>
+              <w:t>频段、Bypass、测量信号</w:t>
+            </w:r>
+          </w:p>
+        </w:tc>
+        <w:tc>
+          <w:tcPr>
+            <w:tcW w:type="dxa" w:w="4160"/>
+            <w:shd w:fill="FAFBFC"/>
+            <w:vAlign w:val="center"/>
+            <w:tcMar>
+              <w:top w:w="80" w:type="dxa"/>
+              <w:bottom w:w="80" w:type="dxa"/>
+              <w:start w:w="120" w:type="dxa"/>
+              <w:end w:w="120" w:type="dxa"/>
+            </w:tcMar>
+          </w:tcPr>
+          <w:p>
+            <w:pPr>
+              <w:spacing w:after="0" w:line="264" w:lineRule="auto"/>
+            </w:pPr>
+            <w:r>
+              <w:rPr>
+                <w:rFonts w:ascii="Calibri" w:hAnsi="Calibri" w:eastAsia="PingFang SC"/>
+                <w:color w:val="1F2937"/>
+                <w:sz w:val="18"/>
+              </w:rPr>
+              <w:t>确认 EQ Bypass=0；峰值段在中心频率测；shelf 的标称频率是约 -6 dB 转折点</w:t>
+            </w:r>
+          </w:p>
+        </w:tc>
+      </w:tr>
+      <w:tr>
+        <w:tc>
+          <w:tcPr>
+            <w:tcW w:type="dxa" w:w="2200"/>
+            <w:vAlign w:val="center"/>
+            <w:tcMar>
+              <w:top w:w="80" w:type="dxa"/>
+              <w:bottom w:w="80" w:type="dxa"/>
+              <w:start w:w="120" w:type="dxa"/>
+              <w:end w:w="120" w:type="dxa"/>
+            </w:tcMar>
+          </w:tcPr>
+          <w:p>
+            <w:pPr>
+              <w:spacing w:after="0" w:line="264" w:lineRule="auto"/>
+            </w:pPr>
+            <w:r>
+              <w:rPr>
+                <w:rFonts w:ascii="Calibri" w:hAnsi="Calibri" w:eastAsia="PingFang SC"/>
+                <w:color w:val="1F2937"/>
+                <w:sz w:val="18"/>
+              </w:rPr>
+              <w:t>某个 dB 不生效</w:t>
+            </w:r>
+          </w:p>
+        </w:tc>
+        <w:tc>
+          <w:tcPr>
+            <w:tcW w:type="dxa" w:w="3000"/>
+            <w:vAlign w:val="center"/>
+            <w:tcMar>
+              <w:top w:w="80" w:type="dxa"/>
+              <w:bottom w:w="80" w:type="dxa"/>
+              <w:start w:w="120" w:type="dxa"/>
+              <w:end w:w="120" w:type="dxa"/>
+            </w:tcMar>
+          </w:tcPr>
+          <w:p>
+            <w:pPr>
+              <w:spacing w:after="0" w:line="264" w:lineRule="auto"/>
+            </w:pPr>
+            <w:r>
+              <w:rPr>
+                <w:rFonts w:ascii="Calibri" w:hAnsi="Calibri" w:eastAsia="PingFang SC"/>
+                <w:color w:val="1F2937"/>
+                <w:sz w:val="18"/>
+              </w:rPr>
+              <w:t>对应 stem 是否有信号</w:t>
+            </w:r>
+          </w:p>
+        </w:tc>
+        <w:tc>
+          <w:tcPr>
+            <w:tcW w:type="dxa" w:w="4160"/>
+            <w:vAlign w:val="center"/>
+            <w:tcMar>
+              <w:top w:w="80" w:type="dxa"/>
+              <w:bottom w:w="80" w:type="dxa"/>
+              <w:start w:w="120" w:type="dxa"/>
+              <w:end w:w="120" w:type="dxa"/>
+            </w:tcMar>
+          </w:tcPr>
+          <w:p>
+            <w:pPr>
+              <w:spacing w:after="0" w:line="264" w:lineRule="auto"/>
+            </w:pPr>
+            <w:r>
+              <w:rPr>
+                <w:rFonts w:ascii="Calibri" w:hAnsi="Calibri" w:eastAsia="PingFang SC"/>
+                <w:color w:val="1F2937"/>
+                <w:sz w:val="18"/>
+              </w:rPr>
+              <w:t>EV 的 Rumble 默认 -60 dB；事件未触发时 Transient Level 不会改变持续电平</w:t>
+            </w:r>
+          </w:p>
+        </w:tc>
+      </w:tr>
+      <w:tr>
+        <w:tc>
+          <w:tcPr>
+            <w:tcW w:type="dxa" w:w="2200"/>
+            <w:shd w:fill="FAFBFC"/>
+            <w:vAlign w:val="center"/>
+            <w:tcMar>
+              <w:top w:w="80" w:type="dxa"/>
+              <w:bottom w:w="80" w:type="dxa"/>
+              <w:start w:w="120" w:type="dxa"/>
+              <w:end w:w="120" w:type="dxa"/>
+            </w:tcMar>
+          </w:tcPr>
+          <w:p>
+            <w:pPr>
+              <w:spacing w:after="0" w:line="264" w:lineRule="auto"/>
+            </w:pPr>
+            <w:r>
+              <w:rPr>
+                <w:rFonts w:ascii="Calibri" w:hAnsi="Calibri" w:eastAsia="PingFang SC"/>
+                <w:color w:val="1F2937"/>
+                <w:sz w:val="18"/>
+              </w:rPr>
               <w:t>换挡没有声音</w:t>
             </w:r>
           </w:p>
@@ -4425,7 +5430,7 @@
         <w:br/>
         <w:t>python3 -m unittest discover -s tests -v</w:t>
         <w:br/>
-        <w:t>python3 tools/audio_metrics.py &lt;render.wav&gt; --max-peak-dbfs -1 --min-rms-dbfs -45 --min-rumble-ratio 0.55 --max-subsonic-ratio 0.05 --max-low-side-ratio 0.10 --max-high-ratio 0.10</w:t>
+        <w:t>python3 tools/audio_metrics.py &lt;render.wav&gt; --max-peak-dbfs -1 --min-rms-dbfs -45 --min-rumble-ratio 0.55 --max-subsonic-ratio 0.05 --max-low-side-ratio 0.10 --max-high-ratio 0.10 --min-spectral-peaks 6 --max-dominant-peak-ratio 0.50</w:t>
       </w:r>
     </w:p>
     <w:p>

</xml_diff>

<commit_message>
feat: add V3.1 cinematic engine mix
</commit_message>
<xml_diff>
--- a/VehicleSoundSynthV3_完整使用手册.docx
+++ b/VehicleSoundSynthV3_完整使用手册.docx
@@ -78,7 +78,7 @@
           <w:color w:val="0B2545"/>
           <w:sz w:val="21"/>
         </w:rPr>
-        <w:t>手册版本 3.1  |  适用 Max 8.6.5  |  2026-08-10</w:t>
+        <w:t>手册版本 3.1  |  适用 Max 8.6.5  |  2026-08-11</w:t>
       </w:r>
     </w:p>
     <w:p>
@@ -737,7 +737,7 @@
                 <w:color w:val="1F2937"/>
                 <w:sz w:val="18"/>
               </w:rPr>
-              <w:t>短车舱 IR、IR 后低频收中、四段 EQ、总增益与唯一 limiter/clip</w:t>
+              <w:t>120 Hz 以下收中、上频段相位/早反射扩宽、可视化四节点 EQ 与唯一 limiter/clip</w:t>
             </w:r>
           </w:p>
         </w:tc>
@@ -1673,6 +1673,84 @@
                 <w:color w:val="1F2937"/>
                 <w:sz w:val="18"/>
               </w:rPr>
+              <w:t>Pad / Ferrari Texture</w:t>
+            </w:r>
+          </w:p>
+        </w:tc>
+        <w:tc>
+          <w:tcPr>
+            <w:tcW w:type="dxa" w:w="1900"/>
+            <w:vAlign w:val="center"/>
+            <w:tcMar>
+              <w:top w:w="80" w:type="dxa"/>
+              <w:bottom w:w="80" w:type="dxa"/>
+              <w:start w:w="120" w:type="dxa"/>
+              <w:end w:w="120" w:type="dxa"/>
+            </w:tcMar>
+          </w:tcPr>
+          <w:p>
+            <w:pPr>
+              <w:spacing w:after="0" w:line="264" w:lineRule="auto"/>
+            </w:pPr>
+            <w:r>
+              <w:rPr>
+                <w:rFonts w:ascii="Calibri" w:hAnsi="Calibri" w:eastAsia="PingFang SC"/>
+                <w:color w:val="1F2937"/>
+                <w:sz w:val="18"/>
+              </w:rPr>
+              <w:t>dB、Mute、Solo</w:t>
+            </w:r>
+          </w:p>
+        </w:tc>
+        <w:tc>
+          <w:tcPr>
+            <w:tcW w:type="dxa" w:w="5360"/>
+            <w:vAlign w:val="center"/>
+            <w:tcMar>
+              <w:top w:w="80" w:type="dxa"/>
+              <w:bottom w:w="80" w:type="dxa"/>
+              <w:start w:w="120" w:type="dxa"/>
+              <w:end w:w="120" w:type="dxa"/>
+            </w:tcMar>
+          </w:tcPr>
+          <w:p>
+            <w:pPr>
+              <w:spacing w:after="0" w:line="264" w:lineRule="auto"/>
+            </w:pPr>
+            <w:r>
+              <w:rPr>
+                <w:rFonts w:ascii="Calibri" w:hAnsi="Calibri" w:eastAsia="PingFang SC"/>
+                <w:color w:val="1F2937"/>
+                <w:sz w:val="18"/>
+              </w:rPr>
+              <w:t>Pad 与 EV 电机并列；Solo 只静音 EV 电机。Ferrari 纹理只用于 V10/V12</w:t>
+            </w:r>
+          </w:p>
+        </w:tc>
+      </w:tr>
+      <w:tr>
+        <w:tc>
+          <w:tcPr>
+            <w:tcW w:type="dxa" w:w="2100"/>
+            <w:shd w:fill="FAFBFC"/>
+            <w:vAlign w:val="center"/>
+            <w:tcMar>
+              <w:top w:w="80" w:type="dxa"/>
+              <w:bottom w:w="80" w:type="dxa"/>
+              <w:start w:w="120" w:type="dxa"/>
+              <w:end w:w="120" w:type="dxa"/>
+            </w:tcMar>
+          </w:tcPr>
+          <w:p>
+            <w:pPr>
+              <w:spacing w:after="0" w:line="264" w:lineRule="auto"/>
+            </w:pPr>
+            <w:r>
+              <w:rPr>
+                <w:rFonts w:ascii="Calibri" w:hAnsi="Calibri" w:eastAsia="PingFang SC"/>
+                <w:color w:val="1F2937"/>
+                <w:sz w:val="18"/>
+              </w:rPr>
               <w:t>Cabin IR Mix</w:t>
             </w:r>
           </w:p>
@@ -1680,6 +1758,7 @@
         <w:tc>
           <w:tcPr>
             <w:tcW w:type="dxa" w:w="1900"/>
+            <w:shd w:fill="FAFBFC"/>
             <w:vAlign w:val="center"/>
             <w:tcMar>
               <w:top w:w="80" w:type="dxa"/>
@@ -1705,6 +1784,7 @@
         <w:tc>
           <w:tcPr>
             <w:tcW w:type="dxa" w:w="5360"/>
+            <w:shd w:fill="FAFBFC"/>
             <w:vAlign w:val="center"/>
             <w:tcMar>
               <w:top w:w="80" w:type="dxa"/>
@@ -1732,7 +1812,6 @@
         <w:tc>
           <w:tcPr>
             <w:tcW w:type="dxa" w:w="2100"/>
-            <w:shd w:fill="FAFBFC"/>
             <w:vAlign w:val="center"/>
             <w:tcMar>
               <w:top w:w="80" w:type="dxa"/>
@@ -1758,7 +1837,6 @@
         <w:tc>
           <w:tcPr>
             <w:tcW w:type="dxa" w:w="1900"/>
-            <w:shd w:fill="FAFBFC"/>
             <w:vAlign w:val="center"/>
             <w:tcMar>
               <w:top w:w="80" w:type="dxa"/>
@@ -1777,14 +1855,13 @@
                 <w:color w:val="1F2937"/>
                 <w:sz w:val="18"/>
               </w:rPr>
-              <w:t>四段</w:t>
+              <w:t>可视化四节点</w:t>
             </w:r>
           </w:p>
         </w:tc>
         <w:tc>
           <w:tcPr>
             <w:tcW w:type="dxa" w:w="5360"/>
-            <w:shd w:fill="FAFBFC"/>
             <w:vAlign w:val="center"/>
             <w:tcMar>
               <w:top w:w="80" w:type="dxa"/>
@@ -1803,7 +1880,7 @@
                 <w:color w:val="1F2937"/>
                 <w:sz w:val="18"/>
               </w:rPr>
-              <w:t>Low Shelf、Low-Mid、High-Mid、High Shelf；峰值段带 Q</w:t>
+              <w:t>拖动曲线节点，或选 0-3 后输入 Frequency/Gain/Q；与 eq_* 消息同步</w:t>
             </w:r>
           </w:p>
         </w:tc>
@@ -1812,6 +1889,7 @@
         <w:tc>
           <w:tcPr>
             <w:tcW w:type="dxa" w:w="2100"/>
+            <w:shd w:fill="FAFBFC"/>
             <w:vAlign w:val="center"/>
             <w:tcMar>
               <w:top w:w="80" w:type="dxa"/>
@@ -1837,6 +1915,7 @@
         <w:tc>
           <w:tcPr>
             <w:tcW w:type="dxa" w:w="1900"/>
+            <w:shd w:fill="FAFBFC"/>
             <w:vAlign w:val="center"/>
             <w:tcMar>
               <w:top w:w="80" w:type="dxa"/>
@@ -1862,6 +1941,7 @@
         <w:tc>
           <w:tcPr>
             <w:tcW w:type="dxa" w:w="5360"/>
+            <w:shd w:fill="FAFBFC"/>
             <w:vAlign w:val="center"/>
             <w:tcMar>
               <w:top w:w="80" w:type="dxa"/>
@@ -1908,7 +1988,7 @@
         <w:rPr>
           <w:rFonts w:ascii="Calibri" w:hAnsi="Calibri" w:eastAsia="PingFang SC"/>
         </w:rPr>
-        <w:t>燃油 Gen 使用四冲程点火阶次：V12 主阶为 rpm/60×6，V10 主阶为 rpm/60×5。V12 在 780 rpm 时主阶约 78 Hz、半阶约 39 Hz；V10 在 850 rpm 时主阶约 70.8 Hz、半阶约 35.4 Hz。主声不是单一 cycle~：由曲轴相关点火脉冲、二至八阶加法谐波、AM/FM 侧带、V12 的 0.83/1.17 与 2.33/2.67 非整数阶次、V10 的 0.81/1.19 与 2.20/2.80 阶次共同构成。新低频模块再用同一 powertrain 音频激励车身与座舱模态，而不是另开一个不相关的正弦振荡器。</w:t>
+        <w:t>燃油 Gen 使用四冲程点火阶次：V12 主阶为 rpm/60×6，V10 主阶为 rpm/60×5。左右声道现在分别模拟两个真实缸列：每个缸列以总点火率的一半工作，右缸列固定错开半个缸列周期，并以少量交叉馈送保持相位稳定，不再使用微失谐制造拍频。主声由点火脉冲、二至八阶加法谐波、±3% 以内的循环差异与脉冲门控窄带燃烧残差共同构成；燃油 Gen 不再注入白噪声。</w:t>
       </w:r>
     </w:p>
     <w:tbl>
@@ -2710,7 +2790,7 @@
                 <w:rFonts w:ascii="Calibri" w:hAnsi="Calibri" w:eastAsia="PingFang SC"/>
                 <w:color w:val="0B2545"/>
               </w:rPr>
-              <w:t>低频层在约 28 Hz 高通；Side 在车舱处理前高通，并在 IR 湿/干混合后再经四级 180 Hz 高通，所以真正的深低频保持居中。最后仍经过全局 EQ、Master Trim 和唯一的 limiter/clip。普通音箱听不清 35 Hz 时，不要盲目把三个旋钮全部推满。</w:t>
+              <w:t>低频层在约 28 Hz 高通；IR 湿/干混合后用 cross~ 120 将 120 Hz 以下合成严格居中的 Mid，上频段才进入左右不同的短 allpass 和 0.65/1.35 ms 早反射，所以低频兼容 mono、机械细节仍有宽度。最后仍经过全局 EQ、Master Trim 和唯一的 limiter/clip。</w:t>
             </w:r>
           </w:p>
         </w:tc>
@@ -3802,7 +3882,7 @@
         <w:rPr>
           <w:rFonts w:ascii="Calibri" w:hAnsi="Calibri" w:eastAsia="PingFang SC"/>
         </w:rPr>
-        <w:t>EQ 已用 Max 运行时 probe 验证：各峰值段在中心频率发送 -12 dB 时约衰减 12 dB；90 Hz 与 9 kHz 的 -12 dB shelf 在测量点约衰减 6 dB（符合 shelf 转折频率定义）；Master Trim 从 -8 到 -24 dB 实测约 -15.9 dB；Bypass 与 flat 的差异约 0.05 dB。</w:t>
+        <w:t>新的 EQ 只使用一张 nfilters=4 的 filtergraph~，系数列表同时送到左右 cascade~。曲线拖动、节点数值、eq_* 消息、Bypass 与 Reset 共用同一 DSP 路径，不再出现界面数值改变但音频仍绕过旧 biquad 的情况。</w:t>
       </w:r>
     </w:p>
     <w:p>
@@ -3810,7 +3890,7 @@
         <w:rPr>
           <w:rFonts w:ascii="Calibri" w:hAnsi="Calibri" w:eastAsia="PingFang SC"/>
         </w:rPr>
-        <w:t>road_air~ 只有两类持续噪声：居中的 pink~ 轮胎床（约 70-900 Hz）和受控立体声 noise~ 风声（约 400-4000 Hz）。Road Level 默认 -16 dB，风声随速度约 1.7 次幂上升；这两层不会再用宽带白噪覆盖整个频谱。</w:t>
+        <w:t>road_air~ 只有两类持续噪声：居中的 pink~ 轮胎床（约 70-900 Hz）和受控立体声 noise~ 风声（约 400-4000 Hz）。Road Level 默认 -16 dB；V10/V12 Gen 内已移除白噪声。</w:t>
       </w:r>
     </w:p>
     <w:p>
@@ -4346,7 +4426,7 @@
                 <w:color w:val="1F2937"/>
                 <w:sz w:val="17"/>
               </w:rPr>
-              <w:t>biholao — Ferrari acceleration</w:t>
+              <w:t>用户 SF90 近场 Ferrari.wav</w:t>
             </w:r>
           </w:p>
         </w:tc>
@@ -4372,7 +4452,7 @@
                 <w:color w:val="1F2937"/>
                 <w:sz w:val="17"/>
               </w:rPr>
-              <w:t>仅作听觉参考</w:t>
+              <w:t>本地去基频残差层，仅 V10/V12</w:t>
             </w:r>
           </w:p>
         </w:tc>
@@ -4398,7 +4478,7 @@
                 <w:color w:val="1F2937"/>
                 <w:sz w:val="17"/>
               </w:rPr>
-              <w:t>不进入运行 patch</w:t>
+              <w:t>250 ms stereo loop、-18 dBFS RMS；media/local 永不提交</w:t>
             </w:r>
           </w:p>
         </w:tc>
@@ -4537,6 +4617,10 @@
         <w:t>powertrain_level_db -3.   transient_level_db -7.</w:t>
         <w:br/>
         <w:t>road_level_db -16.        rumble_level_db -5.</w:t>
+        <w:br/>
+        <w:t>pad_level_db -3.          pad_mute 0            pad_solo 0</w:t>
+        <w:br/>
+        <w:t>reference_texture_level_db -24.   reference_texture_mute 0</w:t>
         <w:br/>
         <w:t>cabin_ir_mix 0.20</w:t>
       </w:r>

</xml_diff>

<commit_message>
fix: harden V3.1 stereo EQ and reference processing
</commit_message>
<xml_diff>
--- a/VehicleSoundSynthV3_完整使用手册.docx
+++ b/VehicleSoundSynthV3_完整使用手册.docx
@@ -1988,6 +1988,14 @@
         <w:rPr>
           <w:rFonts w:ascii="Calibri" w:hAnsi="Calibri" w:eastAsia="PingFang SC"/>
         </w:rPr>
+        <w:t>EV Pad 的 120 Hz 以下会先合成为严格居中的 Mid；只有 120 Hz 以上使用 82/18 左右互混，因此保留左右音色差异的同时，不会在 mono 折叠时丢失底部能量。</w:t>
+      </w:r>
+    </w:p>
+    <w:p>
+      <w:r>
+        <w:rPr>
+          <w:rFonts w:ascii="Calibri" w:hAnsi="Calibri" w:eastAsia="PingFang SC"/>
+        </w:rPr>
         <w:t>燃油 Gen 使用四冲程点火阶次：V12 主阶为 rpm/60×6，V10 主阶为 rpm/60×5。左右声道现在分别模拟两个真实缸列：每个缸列以总点火率的一半工作，右缸列固定错开半个缸列周期，并以少量交叉馈送保持相位稳定，不再使用微失谐制造拍频。主声由点火脉冲、二至八阶加法谐波、±3% 以内的循环差异与脉冲门控窄带燃烧残差共同构成；燃油 Gen 不再注入白噪声。</w:t>
       </w:r>
     </w:p>
@@ -2790,7 +2798,7 @@
                 <w:rFonts w:ascii="Calibri" w:hAnsi="Calibri" w:eastAsia="PingFang SC"/>
                 <w:color w:val="0B2545"/>
               </w:rPr>
-              <w:t>低频层在约 28 Hz 高通；IR 湿/干混合后用 cross~ 120 将 120 Hz 以下合成严格居中的 Mid，上频段才进入左右不同的短 allpass 和 0.65/1.35 ms 早反射，所以低频兼容 mono、机械细节仍有宽度。最后仍经过全局 EQ、Master Trim 和唯一的 limiter/clip。</w:t>
+              <w:t>低频层在约 28 Hz 高通；IR 湿/干混合后用 cross~ 120 将 120 Hz 以下合成严格居中的 Mid，上频段才进入左右不同的短 allpass 和 0.65/1.35 ms 早反射，并有固定 0.85 Side 安全衰减，所以低频兼容 mono、机械细节仍有宽度。最后仍经过全局 EQ、Master Trim 和唯一的 limiter/clip。</w:t>
             </w:r>
           </w:p>
         </w:tc>
@@ -5514,7 +5522,7 @@
         <w:br/>
         <w:t>python3 -m unittest discover -s tests -v</w:t>
         <w:br/>
-        <w:t>python3 tools/audio_metrics.py &lt;render.wav&gt; --max-peak-dbfs -1 --min-rms-dbfs -45 --min-rumble-ratio 0.55 --max-subsonic-ratio 0.05 --max-low-side-ratio 0.10 --max-high-ratio 0.10 --min-spectral-peaks 6 --max-dominant-peak-ratio 0.50</w:t>
+        <w:t>python3 tools/audio_metrics.py &lt;render.wav&gt; --max-peak-dbfs -1 --min-rms-dbfs -45 --min-rumble-ratio 0.55 --max-subsonic-ratio 0.05 --max-low-side-ratio 0.05 --min-low-band-correlation 0.95 --max-mono-fold-rms-loss-db 1.5 --max-high-ratio 0.10 --min-spectral-peaks 6 --max-dominant-peak-ratio 0.50</w:t>
       </w:r>
     </w:p>
     <w:p>
@@ -5556,7 +5564,7 @@
         <w:rPr>
           <w:rFonts w:ascii="Calibri" w:hAnsi="Calibri" w:eastAsia="PingFang SC"/>
         </w:rPr>
-        <w:t>用 audio_metrics.py 检查 peak、RMS、30-140 Hz 轰鸣、20-30 Hz 次声、低频侧声道与 6-20 kHz 能量占比。</w:t>
+        <w:t>用 audio_metrics.py 检查 peak、RMS、30-140 Hz 轰鸣、20-30 Hz 次声、低频 Side/相关性、mono 折叠损失、1/3 倍频程相似度与 6-20 kHz 能量占比。</w:t>
       </w:r>
     </w:p>
     <w:sectPr>

</xml_diff>